<commit_message>
SC1 Growth Infrastructure Roads Lege Brief: tightened ~1,000 chars across 11 passages (no facts removed) so the spotlights fill page 7 and the glossary starts page 8 — 9 pages, no near-empty page before the glossary; all 108 bill ids, vote pairs, and proviso cites re-verified
Co-authored-by: CaptainWrechols <CaptainWrechols@users.noreply.github.com>
</commit_message>
<xml_diff>
--- a/briefs/south-carolina/growth-infrastructure-roads/citizen-v2/SC1-Growth-Infrastructure-Roads-Lege-Brief.docx
+++ b/briefs/south-carolina/growth-infrastructure-roads/citizen-v2/SC1-Growth-Infrastructure-Roads-Lege-Brief.docx
@@ -71,7 +71,7 @@
           <w:szCs w:val="20"/>
           <w:rtl w:val="0"/>
         </w:rPr>
-        <w:t xml:space="preserve">Rapid growth and its weight on roads, infrastructure, and natural resources ranked among the top issues in the Community Conversations, and five proposals advanced: new or expanded local funding tools (penny taxes, impact fees, tolls, parking fees), state or master planning in place of fragmented county plans, fixing existing roads first, opposing new taxes and fees, and a better contractor bidding process. Across the last four two-year sessions (2019–2026), the General Assembly took up 161 growth-and-roads bills in this set, and 12 became law. The wall here is not one committee but the money rooms: 138 of the 161 died in their first committee, 58 of those in House Ways and Means or Senate Finance, because penny taxes, tolls, impact fees, and gas-fee bills are all revenue bills. Nothing in the set ever lost a passage vote on the floor. Against that record, the five proposals sit in very different places. The funding tools mostly already exist as referendum-gated local taxes — but every bill widening them died unheard, impact-fee bills died unheard in both directions, and the one genuinely new tool enacted preserves green space rather than building roads. State master planning has never been filed in the form participants described. Fix-it-first lives outside the bill process: its standalone bills all died, while the money moved through the annual budget and a pothole-repair program passed inside 2026's big SCDOT overhaul. The gas-fee rollback bills died in the same money committees as the funding bills. And contractor accountability holds the record's headline: after dying unheard in 2019 and 2024, the restructuring of SCDOT itself passed near-unanimously in 2026 — carrying new bidding methods, toll rules, and an outside audit with it.</w:t>
+        <w:t xml:space="preserve">Rapid growth and its weight on roads, infrastructure, and natural resources ranked among the top issues in the Community Conversations, and five proposals advanced: new or expanded local funding tools (penny taxes, impact fees, tolls, parking fees), state or master planning in place of fragmented county plans, fixing existing roads first, opposing new taxes and fees, and a better contractor bidding process. Across the last four two-year sessions (2019–2026), the General Assembly took up 161 growth-and-roads bills in this set, and 12 became law. The wall here is not one committee but the money rooms: 138 of the 161 died in their first committee, 58 of those in House Ways and Means or Senate Finance, because penny taxes, tolls, impact fees, and gas-fee bills are all revenue bills. Nothing in the set ever lost a passage vote on the floor. Against that record, the five proposals sit in very different places. The funding tools mostly already exist as referendum-gated local taxes — but every bill widening them died unheard, impact-fee bills died unheard in both directions, and the one genuinely new tool enacted preserves green space rather than building roads. State master planning has never been filed in the form participants described. Fix-it-first lives outside the bill process: its standalone bills all died, while the money moved through the annual budget and a pothole-repair program passed inside 2026's big SCDOT overhaul. The gas-fee rollback bills died in the same money committees as the funding bills. And contractor accountability holds the record's headline: after dying unheard in 2019 and 2024, the restructuring of SCDOT itself passed near-unanimously in 2026, carrying new bidding methods with it.</w:t>
       </w:r>
     </w:p>
     <w:tbl>
@@ -565,7 +565,7 @@
           <w:szCs w:val="20"/>
           <w:rtl w:val="0"/>
         </w:rPr>
-        <w:t xml:space="preserve"> Reported out of Ways and Means, stalled in floor debate, and was recommitted the same week the Senate's S831 passed the House 114–0 — one chamber's version won, and the idea passed anyway. </w:t>
+        <w:t xml:space="preserve"> Reported out of Ways and Means, stalled in floor debate, and recommitted the same week the Senate's S831 passed the House 114–0. </w:t>
       </w:r>
       <w:r>
         <w:rPr>
@@ -587,7 +587,7 @@
           <w:szCs w:val="20"/>
           <w:rtl w:val="0"/>
         </w:rPr>
-        <w:t xml:space="preserve"> — the resolution approving SCDOT's project-ranking rules — passed the House 107–0, earned a favorable Senate committee report, and was recommitted.</w:t>
+        <w:t xml:space="preserve"> passed the House 107–0 and was recommitted in the Senate after a favorable committee report.</w:t>
       </w:r>
     </w:p>
     <w:p>
@@ -808,7 +808,7 @@
           <w:szCs w:val="20"/>
           <w:rtl w:val="0"/>
         </w:rPr>
-        <w:t xml:space="preserve"> Every bill widening the transportation penny died unheard in the money committees: making clear the penny can fund mass transit (filed in all four sessions — S611 and H4389 in 2019, H3535 and S437 in 2021, S290, S562, and H4059 in 2023, S979 in 2026), letting a capital-projects penny stack on a transportation penny (H3129, 2021), eleven-year reimposition (S116, 2023), and grocery exemptions (H5188 and S1113, 2024). All five toll bills died in first committee — four aimed at I-95 at Lake Marion (S178 and H3739 in 2019, S499 in 2023, plus S780's toll-review mandate) and the Interstate 95 Bridge Toll Act (S674, 2023) — as did the local-option one-cent gas fee for beach renourishment (S172, 2019) and the road-use-fee transparency account (H3483, 2021).</w:t>
+        <w:t xml:space="preserve"> Every bill widening the transportation penny died unheard in the money committees: making clear the penny can fund mass transit (filed in all four sessions — S611 and H4389 in 2019, H3535 and S437 in 2021, S290, S562, and H4059 in 2023, S979 in 2026), letting a capital-projects penny stack on a transportation penny (H3129, 2021), eleven-year reimposition (S116, 2023), and grocery exemptions (H5188 and S1113, 2024). All five toll bills died in first committee (S178, H3739, and S780 in 2019; S499 and the I-95 Bridge Toll Act S674 in 2023), as did the local-option gas fee for beach renourishment (S172, 2019) and the road-use-fee transparency account (H3483, 2021).</w:t>
       </w:r>
     </w:p>
     <w:p>
@@ -866,7 +866,7 @@
           <w:szCs w:val="20"/>
           <w:rtl w:val="0"/>
         </w:rPr>
-        <w:t xml:space="preserve"> No bill from 2019–2026 proposes state or regional master planning in place of county plans — the design participants described has never been filed. Around it, everything died in committee: community impact assessments before major zoning decisions (H4390, 2025), the county power to block annexation until an infrastructure impact study is approved (H5742, 2026), county standing to challenge annexations (H4651, 2023), the thrice-filed "donut hole" annexation bill (H5196, H3236, H4726), and the developer-side bills pulling the opposite way — permitting shot-clocks (H4652, H3215), the Home Attainability packages (S528 and H3863 in 2021, S4 in 2023 and 2025), and housing-cost impact analyses (H4482 and S757, 2019).</w:t>
+        <w:t xml:space="preserve"> No bill from 2019–2026 proposes state or regional master planning in place of county plans — the design participants described has never been filed. Around it, everything died in committee: community impact assessments before major zoning decisions (H4390, 2025), county power to block annexation until an infrastructure impact study is approved (H5742, 2026), county standing to challenge annexations (H4651, 2023), the thrice-filed "donut hole" annexation bill (H5196, H3236, H4726), and the developer-side bills pulling the opposite way (permit shot-clocks, the Home Attainability packages, housing-cost impact analyses).</w:t>
       </w:r>
     </w:p>
     <w:p>
@@ -953,7 +953,7 @@
           <w:szCs w:val="20"/>
           <w:rtl w:val="0"/>
         </w:rPr>
-        <w:t xml:space="preserve"> SCDOT design-build pilots (H5312, 2024; H3560, 2025 — the method Act 177 later enacted), the secretary's certification of SCDOT expenditure reports (H4090, 2021), disadvantaged-business contracting rules (S385, H4401, H4823, 2019–20), the public-private partnership framework (H3559, 2021), and the foreign-company critical-infrastructure contract bans (H3119, 2023; H3344, 2025) died in committee. The 2020 resolutions approving SCDOT's own contractor performance-evaluation and disqualification regulations (S1069, S1070) were placed on the Senate calendar and stranded there when COVID ended the session.</w:t>
+        <w:t xml:space="preserve"> SCDOT design-build pilots (H5312, 2024; H3560, 2025 — the method Act 177 later enacted), the secretary's certification of SCDOT expenditure reports (H4090, 2021), disadvantaged-business contracting rules (S385, H4401, H4823, 2019–20), and the public-private partnership framework (H3559, 2021) died in committee; the 2020 resolutions approving SCDOT's own contractor performance-evaluation and disqualification regulations (S1069, S1070) were stranded on the Senate calendar when COVID ended the session.</w:t>
       </w:r>
     </w:p>
     <w:p>
@@ -1107,7 +1107,7 @@
           <w:szCs w:val="20"/>
           <w:rtl w:val="0"/>
         </w:rPr>
-        <w:t xml:space="preserve">The road network's money and rules are layered. Federal-aid highway dollars flow through SCDOT — the budget's provisos on federally funded projects (indirect cost recoveries, federal appraisal waivers) manage that machinery — and the state gas user fee is collected on top of the federal motor-fuels tax that funds the federal-aid system, which is why the suspension resolutions were drafted against the state layer only. Tolling existing interstate lanes is restricted under federal highway law; the I-95 toll bills never advanced far enough to face that hurdle, and Act 177's "choice lane" design permits usage charges only on new capacity. Environmental reviews for federal-aid projects run under the national environmental review law, where South Carolina participates in the federal assignment program — Act 244 of 2026 renewed that machinery and consented to federal-court suits under it. What has no federal layer at all is most of this brief: the local-option penny taxes, the 1999 impact-fee act, comprehensive planning and annexation law, SCDOT's governance, the county "C"-fund system, and the state budget's provisos are state ground alone.</w:t>
+        <w:t xml:space="preserve">The road network's money and rules are layered. Federal-aid highway dollars flow through SCDOT, and the state gas user fee is collected on top of the federal motor-fuels tax that funds the federal-aid system — which is why the suspension resolutions were drafted against the state layer only. Tolling existing interstate lanes is restricted under federal highway law; the I-95 toll bills never advanced far enough to face that hurdle, and Act 177's "choice lane" design permits usage charges only on new capacity. Environmental reviews for federal-aid projects run under the national environmental review law, where South Carolina participates in the federal assignment program — Act 244 of 2026 renewed that machinery and consented to federal-court suits under it. What has no federal layer at all is most of this brief: the penny taxes, the 1999 impact-fee act, planning and annexation law, SCDOT's governance, the "C"-fund system, and the budget's provisos are state ground alone.</w:t>
       </w:r>
     </w:p>
     <w:p>
@@ -1576,7 +1576,7 @@
           <w:szCs w:val="20"/>
           <w:rtl w:val="0"/>
         </w:rPr>
-        <w:t xml:space="preserve">H3129 (2021) — allow stacking a capital-projects penny on a transportation penny; S116 (2023) — eleven-year reimposition; H5188 and S1113 (2024) — grocery exemptions; S449 (2019) — economic-development infrastructure as a capital-penny use; S298, H3911, S1006, and H5744 (2025–26) — workforce housing, greenspace, and emergency-services operations as penny uses.</w:t>
+        <w:t xml:space="preserve">H3129 (2021) — penny stacking; S116 (2023) — eleven-year reimposition; H5188 and S1113 (2024) — grocery exemptions; S449 (2019), S298, H3911, S1006, and H5744 (2025–26) — added penny uses (economic development, workforce housing, greenspace, emergency services).</w:t>
       </w:r>
     </w:p>
     <w:p>
@@ -1656,7 +1656,7 @@
           <w:szCs w:val="20"/>
           <w:rtl w:val="0"/>
         </w:rPr>
-        <w:t xml:space="preserve">S172 (2019) — a county-option one-cent gas fee for beach renourishment, by referendum; H3483 (2021) — local road-use fees kept in a separate audited account; H4597 (2019) — grandfathering a pre-1997 county hospitality fee.</w:t>
+        <w:t xml:space="preserve">S172 (2019) — a county-option one-cent gas fee, by referendum; H3483 (2021) — local road-use fees in a separate audited account; H4597 (2019) — grandfathering a pre-1997 county hospitality fee.</w:t>
       </w:r>
     </w:p>
     <w:p>
@@ -2210,7 +2210,7 @@
           <w:szCs w:val="20"/>
           <w:rtl w:val="0"/>
         </w:rPr>
-        <w:t xml:space="preserve">the Home Attainability permitting packages (S528 and H3863 in 2021, S4 in 2023 and 2025), 45-day permit shot-clocks (H4652 in 2024, H3215 in 2025), housing-cost impact analyses for new ordinances (H4482 and S757, 2019), and plat and subdivision filing changes (H4598 and S833, 2019).</w:t>
+        <w:t xml:space="preserve">the Home Attainability permitting packages (S528/H3863, 2021; S4, 2023 and 2025), 45-day permit shot-clocks (H4652, H3215), housing-cost impact analyses (H4482/S757, 2019), and plat-filing changes (H4598/S833, 2019).</w:t>
       </w:r>
     </w:p>
     <w:p>
@@ -2644,7 +2644,7 @@
           <w:szCs w:val="20"/>
           <w:rtl w:val="0"/>
         </w:rPr>
-        <w:t xml:space="preserve">SCDOT must properly maintain roads transferred into the state system; **H4971 (2026)** — the reverse devolution design, transferring state roads to counties.</w:t>
+        <w:t xml:space="preserve">SCDOT must properly maintain roads transferred into the state system; **H4971 (2026)** — the reverse, transferring state roads to counties.</w:t>
       </w:r>
     </w:p>
     <w:p>
@@ -2684,47 +2684,7 @@
           <w:szCs w:val="20"/>
           <w:rtl w:val="0"/>
         </w:rPr>
-        <w:t xml:space="preserve">the pothole-damage hotline bills — the design Act 177's program later enacted.</w:t>
-      </w:r>
-    </w:p>
-    <w:p>
-      <w:pPr>
-        <w:widowControl/>
-        <w:spacing w:after="80"/>
-        <w:ind w:left="200" w:firstLine="0"/>
-        <w:rPr/>
-      </w:pPr>
-      <w:r>
-        <w:rPr>
-          <w:rFonts w:ascii="Arial" w:cs="Arial" w:eastAsia="Arial" w:hAnsi="Arial"/>
-          <w:color w:val="c0392b"/>
-          <w:sz w:val="20"/>
-          <w:szCs w:val="20"/>
-          <w:rtl w:val="0"/>
-        </w:rPr>
-        <w:t xml:space="preserve">▪  </w:t>
-      </w:r>
-      <w:r>
-        <w:rPr>
-          <w:rFonts w:ascii="Arial" w:cs="Arial" w:eastAsia="Arial" w:hAnsi="Arial"/>
-          <w:b w:val="1"/>
-          <w:bCs w:val="1"/>
-          <w:color w:val="1a2d4f"/>
-          <w:sz w:val="20"/>
-          <w:szCs w:val="20"/>
-          <w:rtl w:val="0"/>
-        </w:rPr>
-        <w:t xml:space="preserve">H4687 (2025): </w:t>
-      </w:r>
-      <w:r>
-        <w:rPr>
-          <w:rFonts w:ascii="Arial" w:cs="Arial" w:eastAsia="Arial" w:hAnsi="Arial"/>
-          <w:color w:val="444444"/>
-          <w:sz w:val="20"/>
-          <w:szCs w:val="20"/>
-          <w:rtl w:val="0"/>
-        </w:rPr>
-        <w:t xml:space="preserve">sheriff road-hazard reports to SCDOT with a mandatory response and public database; **H3516 (2023)** — county maintenance of orphan private roads; **S1043 (2022)** — fifteen percent of county "C" funds to rural roads.</w:t>
+        <w:t xml:space="preserve">the pothole-hotline bills — the design Act 177's program later enacted; **H4687 (2025)** — sheriff road-hazard reports with a public database; **H3516 (2023)** — county maintenance of orphan private roads; **S1043 (2022)** — fifteen percent of "C" funds to rural roads.</w:t>
       </w:r>
     </w:p>
     <w:p>
@@ -3514,7 +3474,7 @@
           <w:szCs w:val="20"/>
           <w:rtl w:val="0"/>
         </w:rPr>
-        <w:t xml:space="preserve">H4090 (2021) — the secretary would certify and publish SCDOT's expenditure report, including infrastructure-bank transfers; S385, H4401, and H4823 (2019–20) — disadvantaged-business participation across highway contracts and subcontracts; H3559 (2021) — the Partnership for Public Facilities and Infrastructure Act; H3119 (2023) and H3344 (2025) — no critical-infrastructure contracts with certain foreign-owned companies; H4369 (2019) — the project-prioritization regulation resolution, passed the House 107–0 and recommitted in the Senate.</w:t>
+        <w:t xml:space="preserve">H4090 (2021) — certified public SCDOT expenditure reports; S385, H4401, and H4823 (2019–20) — disadvantaged-business participation in highway contracting; H3559 (2021) — the public-private partnership framework; H3119 and H3344 (2023, 2025) — foreign-company contract bans; H4369 (2019) — the prioritization-regulation resolution, House 107–0, recommitted in the Senate.</w:t>
       </w:r>
     </w:p>
     <w:p>

</xml_diff>

<commit_message>
SC1 Growth Infrastructure Roads Lege Brief: approved A-E state-vs-county scope clarifications in plain language (legislature-only scope note; impact fees charged by local ordinance; counties plan continuously under state mandate; county committees pick C-fund projects; parking already a city power) with offsetting trims — still 9 pp, spotlights fill p7, glossary starts p8, no gap; 108 bill ids + all vote pairs re-verified
Co-authored-by: CaptainWrechols <CaptainWrechols@users.noreply.github.com>
</commit_message>
<xml_diff>
--- a/briefs/south-carolina/growth-infrastructure-roads/citizen-v2/SC1-Growth-Infrastructure-Roads-Lege-Brief.docx
+++ b/briefs/south-carolina/growth-infrastructure-roads/citizen-v2/SC1-Growth-Infrastructure-Roads-Lege-Brief.docx
@@ -71,7 +71,7 @@
           <w:szCs w:val="20"/>
           <w:rtl w:val="0"/>
         </w:rPr>
-        <w:t xml:space="preserve">Rapid growth and its weight on roads, infrastructure, and natural resources ranked among the top issues in the Community Conversations, and five proposals advanced: new or expanded local funding tools (penny taxes, impact fees, tolls, parking fees), state or master planning in place of fragmented county plans, fixing existing roads first, opposing new taxes and fees, and a better contractor bidding process. Across the last four two-year sessions (2019–2026), the General Assembly took up 161 growth-and-roads bills in this set, and 12 became law. The wall here is not one committee but the money rooms: 138 of the 161 died in their first committee, 58 of those in House Ways and Means or Senate Finance, because penny taxes, tolls, impact fees, and gas-fee bills are all revenue bills. Nothing in the set ever lost a passage vote on the floor. Against that record, the five proposals sit in very different places. The funding tools mostly already exist as referendum-gated local taxes — but every bill widening them died unheard, impact-fee bills died unheard in both directions, and the one genuinely new tool enacted preserves green space rather than building roads. State master planning has never been filed in the form participants described. Fix-it-first lives outside the bill process: its standalone bills all died, while the money moved through the annual budget and a pothole-repair program passed inside 2026's big SCDOT overhaul. The gas-fee rollback bills died in the same money committees as the funding bills. And contractor accountability holds the record's headline: after dying unheard in 2019 and 2024, the restructuring of SCDOT itself passed near-unanimously in 2026, carrying new bidding methods with it.</w:t>
+        <w:t xml:space="preserve">Rapid growth and its weight on roads, infrastructure, and natural resources ranked among the top issues in the Community Conversations, and five proposals advanced: new or expanded local funding tools (penny taxes, impact fees, tolls, parking fees), state or master planning in place of fragmented county plans, fixing existing roads first, opposing new taxes and fees, and a better contractor bidding process. Across the last four two-year sessions (2019–2026), the General Assembly took up 161 growth-and-roads bills in this set, and 12 became law. The wall here is not one committee but the money rooms: 138 of the 161 died in their first committee, 58 of those in House Ways and Means or Senate Finance, because penny taxes, tolls, impact fees, and gas-fee bills are all revenue bills. Nothing in the set ever lost a passage vote on the floor. Against that record, the five proposals sit in very different places. The funding tools mostly already exist as referendum-gated local taxes — but every bill widening them died unheard, impact-fee bills died unheard in both directions, and the one new tool enacted preserves green space rather than building roads. State master planning has never been filed in the form participants described. Fix-it-first moved outside the bill process — through the annual budget, and a pothole-repair program inside 2026's big SCDOT overhaul — while its standalone bills died. The gas-fee rollbacks died in the same money committees as the funding bills. And contractor accountability holds the record's headline: after dying unheard in 2019 and 2024, the restructuring of SCDOT itself passed near-unanimously in 2026, carrying new bidding methods with it. One note on what this brief counts: action by the state legislature only. Several proposals name tools state law already hands to counties and cities — penny taxes, impact fees, parking rules, local growth plans — and counties put those to work one by one, outside the legislature. A quiet record here does not mean a tool is going unused.</w:t>
       </w:r>
     </w:p>
     <w:tbl>
@@ -382,7 +382,7 @@
           <w:szCs w:val="20"/>
           <w:rtl w:val="0"/>
         </w:rPr>
-        <w:t xml:space="preserve">Much of what happens on roads never appears in a stand-alone law. It lives in provisos — one-year policy rules enacted inside Part IB of the annual budget bill. The money is the headline: FY 2024-25's one-time list (proviso 118.22) put $200,000,000 into a CTC Acceleration Fund for the county boards that fix local roads, $100,000,000 into a Bridge Acceleration Fund, and $117,401,000 into a Rural Road Safety Program; FY 2025-26 added $200,000,000 for Bridge Modernization; FY 2026-27 added $175,000,000 (CTC) and $50,000,000 (bridges) more. FY 2026-27 also created the Road Buyback Program (proviso 84.18): SCDOT must list state roads that no longer serve a statewide purpose and pay counties and cities to take them back, resurfaced first, with a report due February 2027. The rules recur annually: proviso 86.1, renewed every enacted year, requires the 2017 gas-tax act's extra County Transportation Committee money be spent exclusively on repairs, maintenance, and improvements; SCDOT must publish its project priority lists with the ranking methodology (84.8); and since FY 2024-25 the department is directed to upgrade its public Programmed Project Viewer dashboard — status, forecast versus actual cost, and an on-time/on-budget list per project (84.15). One proviso cut the other way: FY 2021-22's 117.96 barred impact fees on new school construction for one year, the record's only enacted impact-fee rule, not renewed. One budget year is a gap: FY 2020-21 has no enacted proviso set — the budget bill died in committee during COVID and the state ran on a continuing resolution. Votes on provisos are votes on the whole budget bill, never on one proviso alone.</w:t>
+        <w:t xml:space="preserve">Much of what happens on roads never appears in a stand-alone law. It lives in provisos — one-year policy rules enacted inside Part IB of the annual budget bill. The money is the headline: FY 2024-25's one-time list (proviso 118.22) put $200,000,000 into a CTC Acceleration Fund for the county boards that fix local roads, $100,000,000 into bridges, and $117,401,000 into rural road safety; FY 2025-26 added $200,000,000 for Bridge Modernization; FY 2026-27 added $175,000,000 (CTC) and $50,000,000 (bridges). FY 2026-27 also created the Road Buyback Program (proviso 84.18): SCDOT must list state roads that no longer serve a statewide purpose and pay counties and cities to take them back, resurfaced first. The rules recur annually: proviso 86.1 requires the 2017 gas-tax act's extra county-committee money go exclusively to repairs, maintenance, and improvements; SCDOT must publish its project priority lists with the ranking methodology (84.8); and since FY 2024-25 it is directed to upgrade its public project dashboard — status, forecast versus actual cost, on-time/on-budget (84.15). One proviso cut the other way: FY 2021-22's 117.96 barred impact fees on new school construction for one year, the record's only enacted impact-fee rule, not renewed. One budget year is a gap: FY 2020-21 has no enacted proviso set (the budget bill died during COVID; the state ran on a continuing resolution). Votes on provisos are votes on the whole budget bill, never on one proviso alone.</w:t>
       </w:r>
     </w:p>
     <w:p>
@@ -449,7 +449,7 @@
           <w:szCs w:val="20"/>
           <w:rtl w:val="0"/>
         </w:rPr>
-        <w:t xml:space="preserve"> the Shortline Railroad Modernization Act — a tax credit covering half of small railroads' track-rebuilding costs — passed the House 106–3, then 65–46 on its refile, and died in Senate Finance both times.</w:t>
+        <w:t xml:space="preserve"> the Shortline Railroad Modernization Act — a tax credit for small railroads' track rebuilding — passed the House 106–3, then 65–46, and died in Senate Finance both times.</w:t>
       </w:r>
     </w:p>
     <w:p>
@@ -478,7 +478,7 @@
           <w:szCs w:val="20"/>
           <w:rtl w:val="0"/>
         </w:rPr>
-        <w:t xml:space="preserve"> The Rural Infrastructure Authority package, folding the state's water-and-sewer loan authorities under one staff, passed the House 112–0 and died in Senate Finance; the refile (H3373, 2025) died in House Ways and Means.</w:t>
+        <w:t xml:space="preserve"> The Rural Infrastructure Authority package passed the House 112–0 and died in Senate Finance; the refile (H3373, 2025) died in House Ways and Means.</w:t>
       </w:r>
     </w:p>
     <w:p>
@@ -507,7 +507,7 @@
           <w:szCs w:val="20"/>
           <w:rtl w:val="0"/>
         </w:rPr>
-        <w:t xml:space="preserve"> The growth-management design closest to what participants described: local governments could require that roads and pipes keep pace before new development is approved. Reported favorably out of committee, amended on the Senate floor on April 29, 2026 — then the session ended before it completed passage. The furthest any growth-management bill traveled in this record; its House twin (H4050) never moved.</w:t>
+        <w:t xml:space="preserve"> Local governments could require that roads and pipes keep pace before new development is approved. Reported favorably, amended on the Senate floor April 29, 2026 — then the session ended before it completed passage. The furthest any growth-management bill traveled in this record; its House twin (H4050) never moved.</w:t>
       </w:r>
     </w:p>
     <w:p>
@@ -683,7 +683,7 @@
           <w:szCs w:val="20"/>
           <w:rtl w:val="0"/>
         </w:rPr>
-        <w:t xml:space="preserve"> — Senate 37–1, House 114–0, conference report adopted 112–2 and 43–0). The Governor now appoints the Secretary of Transportation; the seven-member commission is abolished January 1, 2027, its duties devolved to the secretary. And the act is an omnibus: it created the Pothole Mitigation Program (public pothole reports — including a free phone app — with a seven-day repair requirement and $15 million a year for repeat potholes), gave SCDOT phased design-build and construction-manager/general-contractor bidding authority, rewrote toll law around new-capacity "choice lanes," authorized public-private partnership agreements up to sixty years, required an independent outside audit of SCDOT every four years, and reset the county "C"-funds rule to a thirty-three percent state-highway share. The same design had died unheard in House Judiciary in 2019 (H3111) and 2024 (H5045). The one new local funding tool is </w:t>
+        <w:t xml:space="preserve"> — Senate 37–1, House 114–0, conference report adopted 112–2 and 43–0). The Governor now appoints the Secretary of Transportation; the seven-member commission is abolished January 1, 2027. And the act is an omnibus: it created the Pothole Mitigation Program (public pothole reports — including a free phone app — a seven-day repair requirement, and $15 million a year for repeat potholes), gave SCDOT phased design-build and construction-manager/general-contractor bidding authority, rewrote toll law around new-capacity "choice lanes," authorized public-private partnerships up to sixty years, required an outside audit every four years, and reset the county "C"-funds rule to a thirty-three percent state-highway share. The same design had died unheard in House Judiciary in 2019 (H3111) and 2024 (H5045). The one new local funding tool is </w:t>
       </w:r>
       <w:r>
         <w:rPr>
@@ -705,7 +705,7 @@
           <w:szCs w:val="20"/>
           <w:rtl w:val="0"/>
         </w:rPr>
-        <w:t xml:space="preserve"> Senate 43–1 and 41–3, House 67–28): a voter-approved penny for preserving open land — a preservation penny, not a roads penny. The rest passed near-unanimously at the edges: statewide resilience planning with a required resiliency element in every local comprehensive plan (S259, Act 163 of 2020, 44–1 and 65–35); the road-funding vehicle fee's titling fix (H3505, Act 70 of 2021, 106–4 and 42–2); utility-relocation costs assigned on road projects (S401, Act 36 of 2019, 38–0 and 108–0; extended to 2032 by H3768, Act 244 of 2026, 103–0 and 44–0); the school-buildings penny opened to more counties (H4589, Act 203 of 2026, 81–18 and 40–2); tourism taxes for flooding and drainage repair (S217, Act 146 of 2020, 34–2 and 87–15); beach-parking rules on state highways (S40, Act 89 of 2021, 44–0 and 102–10); the EV-charging framework (S304, Act 46 of 2021, 43–1 and 110–2); statewide 5G small-cell rules limiting local zoning control (H4262, Act 179 of 2020, 108–2, 32–6, and 104–1); and a transit-facility trespass law (S399, Act 222 of 2026, 44–0 and 107–0).</w:t>
+        <w:t xml:space="preserve"> Senate 43–1 and 41–3, House 67–28): a voter-approved penny for preserving open land, not for roads. The rest passed near-unanimously at the edges: resilience planning with a required element in every local comprehensive plan (S259, Act 163 of 2020, 44–1 and 65–35); the road-funding vehicle fee's titling fix (H3505, Act 70 of 2021, 106–4 and 42–2); utility-relocation costs on road projects (S401, Act 36 of 2019, 38–0 and 108–0; extended by H3768, Act 244 of 2026, 103–0 and 44–0); the school-buildings penny expansion (H4589, Act 203 of 2026, 81–18 and 40–2); tourism taxes for flooding and drainage (S217, Act 146 of 2020, 34–2 and 87–15); beach-parking rules (S40, Act 89 of 2021, 44–0 and 102–10); the EV-charging framework (S304, Act 46 of 2021, 43–1 and 110–2); 5G small-cell rules limiting local zoning control (H4262, Act 179 of 2020, 108–2, 32–6, and 104–1); and transit-facility trespass (S399, Act 222 of 2026, 44–0 and 107–0).</w:t>
       </w:r>
     </w:p>
     <w:p>
@@ -741,7 +741,7 @@
           <w:szCs w:val="20"/>
           <w:rtl w:val="0"/>
         </w:rPr>
-        <w:t xml:space="preserve">Act 177's path is the record's clearest signal: a design that sat unheard for six years passed 114–0 once Senate leadership carried it — and it absorbed ideas whose standalone bills had died, from design-build bidding to pothole reporting. The budget is the proven venue for fix-it-first money — $842.4 million in one-time road and bridge sums across the last three enacted budgets, plus renewed-every-year maintenance rules — and the Road Buyback Program extends that lane. The flexibility pattern also recurs: when a funding bill is narrow, referendum-gated, or opens an existing tool to more users (the green-space penny, the school-penny expansion, tourism-tax drainage), it passes by wide margins in the same chambers where broader versions never get hearings.</w:t>
+        <w:t xml:space="preserve">Act 177's path is the clearest signal: a design unheard for six years passed 114–0 once Senate leadership carried it, absorbing ideas whose standalone bills had died — design-build bidding, pothole reporting. The budget is the proven venue for fix-it-first money ($842.4 million in one-time sums across the last three budgets, plus renewed-every-year maintenance rules), and the Road Buyback Program extends that lane. And when a funding bill is narrow, referendum-gated, or opens an existing tool to more users — the green-space penny, the school-penny expansion, tourism-tax drainage — it passes by wide margins in the same chambers where broader versions never get hearings.</w:t>
       </w:r>
     </w:p>
     <w:p>
@@ -808,7 +808,7 @@
           <w:szCs w:val="20"/>
           <w:rtl w:val="0"/>
         </w:rPr>
-        <w:t xml:space="preserve"> Every bill widening the transportation penny died unheard in the money committees: making clear the penny can fund mass transit (filed in all four sessions — S611 and H4389 in 2019, H3535 and S437 in 2021, S290, S562, and H4059 in 2023, S979 in 2026), letting a capital-projects penny stack on a transportation penny (H3129, 2021), eleven-year reimposition (S116, 2023), and grocery exemptions (H5188 and S1113, 2024). All five toll bills died in first committee (S178, H3739, and S780 in 2019; S499 and the I-95 Bridge Toll Act S674 in 2023), as did the local-option gas fee for beach renourishment (S172, 2019) and the road-use-fee transparency account (H3483, 2021).</w:t>
+        <w:t xml:space="preserve"> Every bill widening the transportation penny died unheard in the money committees: making clear the penny can fund mass transit (filed all four sessions — S611/H4389 in 2019, H3535/S437 in 2021, S290, S562, and H4059 in 2023, S979 in 2026), penny stacking (H3129, 2021), eleven-year reimposition (S116, 2023), and grocery exemptions (H5188/S1113, 2024). All five toll bills died in first committee (S178, H3739, and S780 in 2019; S499 and the I-95 Bridge Toll Act S674 in 2023), as did the local-option gas fee for beach renourishment (S172, 2019) and the road-use-fee transparency account (H3483, 2021).</w:t>
       </w:r>
     </w:p>
     <w:p>
@@ -837,7 +837,7 @@
           <w:szCs w:val="20"/>
           <w:rtl w:val="0"/>
         </w:rPr>
-        <w:t xml:space="preserve"> Ten bills fought over the 1999 Development Impact Fee Act and none received a hearing: expanding it — residential-only fees (H4659, 2023), road resurfacing as a fundable cost (H5088, 2026), a developer fee funding anti-displacement help (H3460, 2021; H4008, 2025), debt payoff for older fee programs (H4943, 2022) — and narrowing it for the building industry — excluding maintenance and administrative costs (H4981 and S856, 2023–24; the H5017/H3165 packages), exempting repeat in-district buyers (H4672, 2025).</w:t>
+        <w:t xml:space="preserve"> Ten bills fought over the 1999 Development Impact Fee Act and none received a hearing: expanding it — residential-only fees (H4659), resurfacing as a fundable cost (H5088), a developer fee funding anti-displacement help (H3460, H4008), debt payoff for older fee programs (H4943) — and narrowing it for the building industry — excluding maintenance and administrative costs (H4981, S856, the H5017/H3165 packages), exempting repeat in-district buyers (H4672).</w:t>
       </w:r>
     </w:p>
     <w:p>
@@ -866,7 +866,7 @@
           <w:szCs w:val="20"/>
           <w:rtl w:val="0"/>
         </w:rPr>
-        <w:t xml:space="preserve"> No bill from 2019–2026 proposes state or regional master planning in place of county plans — the design participants described has never been filed. Around it, everything died in committee: community impact assessments before major zoning decisions (H4390, 2025), county power to block annexation until an infrastructure impact study is approved (H5742, 2026), county standing to challenge annexations (H4651, 2023), the thrice-filed "donut hole" annexation bill (H5196, H3236, H4726), and the developer-side bills pulling the opposite way (permit shot-clocks, the Home Attainability packages, housing-cost impact analyses).</w:t>
+        <w:t xml:space="preserve"> No bill from 2019–2026 proposes state or regional master planning in place of county plans — the design participants described has never been filed. Around it, everything died in committee: community impact assessments before major zoning decisions (H4390), county power to block annexation until an infrastructure impact study is approved (H5742), county standing to challenge annexations (H4651), the thrice-filed "donut hole" annexation bill (H5196, H3236, H4726), and the developer-side bills pulling the opposite way (permit shot-clocks, the Home Attainability packages, housing-cost impact analyses).</w:t>
       </w:r>
     </w:p>
     <w:p>
@@ -895,7 +895,7 @@
           <w:szCs w:val="20"/>
           <w:rtl w:val="0"/>
         </w:rPr>
-        <w:t xml:space="preserve"> The "Fix Our Roads Accountability Act" pavement-preservation program (H5363, 2026), the rule that SCDOT must maintain roads it absorbs (H4610, 2023), pothole-damage hotlines (H3871, 2021; H3451, 2023), sheriff road-hazard reports with a public database (H4687, 2025), county maintenance of orphan private roads (H3516, 2023), and the road-devolution bill (H4971, 2026) all died in first committee — before Act 177 enacted the pothole-reporting idea.</w:t>
+        <w:t xml:space="preserve"> The "Fix Our Roads Accountability Act" pavement-preservation program (H5363), the rule that SCDOT must maintain roads it absorbs (H4610), pothole-damage hotlines (H3871, H3451), sheriff road-hazard reports (H4687), county maintenance of orphan private roads (H3516), and the road-devolution bill (H4971) all died in first committee — before Act 177 enacted the pothole-reporting idea.</w:t>
       </w:r>
     </w:p>
     <w:p>
@@ -924,7 +924,7 @@
           <w:szCs w:val="20"/>
           <w:rtl w:val="0"/>
         </w:rPr>
-        <w:t xml:space="preserve"> Ten measures to freeze, repeal, or suspend the gas user fee died in the money committees without a vote: the freeze at eight cents (H4091, 2021), outright repeal (H4092, 2021), the 2022 price-spike suspensions (H5103; H5112's $3.25 trigger), and the 2026 wave (S1045 plus five near-identical House resolutions, H5398, H5419, H5422, H5443, H5475). So did the EV road-fee repeals (H4945, 2022; H3177, 2023) — and the one bill pointing the other way, H5331 (2026), which would have more than doubled the counties' share of the gas fee.</w:t>
+        <w:t xml:space="preserve"> Ten measures to freeze, repeal, or suspend the gas user fee died in the money committees without a vote: the freeze at eight cents (H4091), outright repeal (H4092), the 2022 price-spike suspensions (H5103; H5112's $3.25 trigger), and the 2026 wave (S1045 plus five near-identical House resolutions, H5398–H5475). So did the EV road-fee repeals (H4945, H3177) — and the one bill pointing the other way, H5331 (2026), which would have more than doubled the counties' share of the gas fee.</w:t>
       </w:r>
     </w:p>
     <w:p>
@@ -1001,7 +1001,7 @@
           <w:szCs w:val="20"/>
           <w:rtl w:val="0"/>
         </w:rPr>
-        <w:t xml:space="preserve"> SCDOT's structure and tools — Act 177 passed near-unanimously as an omnibus, absorbing bidding methods, pothole repair, toll rules, and an audit whose standalone versions had died. The budget — the fix-first money ($842.4 million over three budgets), the Road Buyback Program, and the renewed-every-year maintenance and transparency rules all move there. And the narrow, referendum-gated edges of the funding toolbox — the green-space penny, the school-penny expansion, tourism-tax flexibility — pass by wide margins. </w:t>
+        <w:t xml:space="preserve"> SCDOT's structure and tools (Act 177, a near-unanimous omnibus absorbing bidding methods, pothole repair, toll rules, and an audit); the budget (the fix-first money, the Road Buyback Program, the renewed-every-year maintenance and transparency rules); and the narrow, referendum-gated edges of the funding toolbox (the green-space penny, the school-penny expansion, tourism-tax flexibility), which pass by wide margins. </w:t>
       </w:r>
       <w:r>
         <w:rPr>
@@ -1052,7 +1052,7 @@
           <w:szCs w:val="20"/>
           <w:rtl w:val="0"/>
         </w:rPr>
-        <w:t xml:space="preserve"> The first committee is this record's great filter, and here it is the money rooms — House Ways and Means (41 first-committee deaths) and Senate Finance (17) — plus House Education and Public Works, the House's transportation committee (21). South Carolina publishes committee outcomes but never committee vote tallies, so no count exists for any of these stops; and party labels are deliberately absent throughout this packet — attaching them requires a ballot-roster join that was not fetched — so this brief makes no party claims. Rep. Pendarvis led twelve bills in the policy set (the transit-funding lane, penny stacking, EV-fee repeals); Sen. Davis led seven, including the enacted green-space penny and the 2026 concurrency bill; Rep. Hixon led seven (rural water-sewer infrastructure, transferred-roads maintenance); Sen. Scott six (transportation authorities and broadband); Sen. Hutto the three I-95 toll bills; and Sen. Grooms carried the SCDOT Modernization Act. In 2026, Rep. White filed a four-bill SCDOT accountability package — road-hazard reports, the county gas-fee share, dissolving the commission, pavement preservation — and all four died in committee the same spring S831 passed the House 114–0.</w:t>
+        <w:t xml:space="preserve"> The first committee is this record's great filter, and here it is the money rooms — House Ways and Means (41 first-committee deaths) and Senate Finance (17) — plus House Education and Public Works, the House's transportation committee (21). South Carolina publishes committee outcomes but never committee vote tallies, so no count exists for any of these stops; and party labels are deliberately absent throughout this packet — attaching them requires a ballot-roster join that was not fetched — so this brief makes no party claims. Rep. Pendarvis led twelve bills in the policy set (transit funding, penny stacking, EV-fee repeals); Sen. Davis seven (the enacted green-space penny, the 2026 concurrency bill); Rep. Hixon seven (water-sewer infrastructure, road maintenance); Sen. Scott six; Sen. Hutto the I-95 toll bills; Sen. Grooms carried the SCDOT Modernization Act. In 2026, Rep. White's four-bill SCDOT accountability package (road-hazard reports, the county gas-fee share, dissolving the commission, pavement preservation) died in committee the same spring S831 passed the House 114–0.</w:t>
       </w:r>
     </w:p>
     <w:p>
@@ -1218,7 +1218,7 @@
           <w:szCs w:val="20"/>
           <w:rtl w:val="0"/>
         </w:rPr>
-        <w:t xml:space="preserve">Raised in Columbia, Florence, and Charleston, with high consensus: broad agreement that the state needs to look for new sources of funding. The concern raised: people don't like being taxed if they don't know where the money is going — participants attached the condition that any new tax come with greater transparency. The record: the tools mostly already exist and every one is referendum-gated — the ballot must list the projects, which is where the transparency condition already lives — but every bill widening them died unheard, and the one new tool enacted preserves land rather than building roads.</w:t>
+        <w:t xml:space="preserve">Raised in Columbia, Florence, and Charleston, with high consensus: broad agreement that the state needs new sources of funding. The concern: people don't like being taxed without knowing where the money goes — participants attached the condition that new taxes come with transparency. The record: the tools mostly already exist, each referendum-gated with the projects listed on the ballot (where that transparency condition already lives) — but every widening bill died unheard, and the one new tool enacted preserves land rather than building roads.</w:t>
       </w:r>
     </w:p>
     <w:p>
@@ -1277,7 +1277,7 @@
           <w:szCs w:val="20"/>
           <w:rtl w:val="0"/>
         </w:rPr>
-        <w:t xml:space="preserve">counties may levy a transportation penny (which can include tolls) and a capital-projects penny, each only by voter referendum with the projects listed on the ballot; the 1999 Development Impact Fee Act authorizes local impact fees under strict conditions (a capital-improvements plan first; no funding of maintenance or operations).</w:t>
+        <w:t xml:space="preserve">counties may levy a transportation penny (which can include tolls) and a capital-projects penny, each only by voter referendum with the projects listed on the ballot; the 1999 Development Impact Fee Act authorizes local impact fees under strict conditions (a capital-improvements plan first; no funding of maintenance or operations). Parking pricing is already a city power — S40 below is this record's one state law about it.</w:t>
       </w:r>
     </w:p>
     <w:p>
@@ -1536,7 +1536,7 @@
           <w:szCs w:val="20"/>
           <w:rtl w:val="0"/>
         </w:rPr>
-        <w:t xml:space="preserve">S611 and H4389 (2019), H3535 and S437 (2021), S290, S562, and H4059 (2023), S979 (2026) — clarifying that penny revenue can fund mass transit, or adding ferries, greenbelts, greenways, and drainage to fundable projects.</w:t>
+        <w:t xml:space="preserve">S611/H4389 (2019), H3535/S437 (2021), S290, S562, and H4059 (2023), S979 (2026) — clarifying that penny revenue can fund mass transit, or adding ferries, greenbelts, and drainage to fundable projects.</w:t>
       </w:r>
     </w:p>
     <w:p>
@@ -1800,6 +1800,46 @@
     </w:p>
     <w:p>
       <w:pPr>
+        <w:widowControl/>
+        <w:spacing w:after="80"/>
+        <w:ind w:left="200" w:firstLine="0"/>
+        <w:rPr/>
+      </w:pPr>
+      <w:r>
+        <w:rPr>
+          <w:rFonts w:ascii="Arial" w:cs="Arial" w:eastAsia="Arial" w:hAnsi="Arial"/>
+          <w:color w:val="c0392b"/>
+          <w:sz w:val="20"/>
+          <w:szCs w:val="20"/>
+          <w:rtl w:val="0"/>
+        </w:rPr>
+        <w:t xml:space="preserve">▪  </w:t>
+      </w:r>
+      <w:r>
+        <w:rPr>
+          <w:rFonts w:ascii="Arial" w:cs="Arial" w:eastAsia="Arial" w:hAnsi="Arial"/>
+          <w:b w:val="1"/>
+          <w:bCs w:val="1"/>
+          <w:color w:val="1a2d4f"/>
+          <w:sz w:val="20"/>
+          <w:szCs w:val="20"/>
+          <w:rtl w:val="0"/>
+        </w:rPr>
+        <w:t xml:space="preserve">Who actually charges the fee: </w:t>
+      </w:r>
+      <w:r>
+        <w:rPr>
+          <w:rFonts w:ascii="Arial" w:cs="Arial" w:eastAsia="Arial" w:hAnsi="Arial"/>
+          <w:color w:val="444444"/>
+          <w:sz w:val="20"/>
+          <w:szCs w:val="20"/>
+          <w:rtl w:val="0"/>
+        </w:rPr>
+        <w:t xml:space="preserve">a county or city, by local ordinance after a required study — decisions made county by county, outside the legislature. The bills above are fights over the state rulebook that governs those local fees, not a sign the fees are unused.</w:t>
+      </w:r>
+    </w:p>
+    <w:p>
+      <w:pPr>
         <w:keepNext/>
         <w:spacing w:before="84" w:after="36" w:line="254" w:lineRule="auto"/>
         <w:rPr/>
@@ -1833,7 +1873,7 @@
           <w:szCs w:val="20"/>
           <w:rtl w:val="0"/>
         </w:rPr>
-        <w:t xml:space="preserve">Raised in all four community conversations — the highest frequency in this issue — with mixed consensus: some cited the efficiency gains of centralized planning while others remained skeptical of removing local control; it was a consensus recommendation in Charleston. The concern raised: removing local control could allow the state to go against residents' wishes. The record: the design participants described has never been filed; what exists is one enacted state layer on local plans, a growth-management bill that died at the last step, and annexation fights pulling both directions.</w:t>
+        <w:t xml:space="preserve">Raised in all four community conversations — the highest frequency in this issue — with mixed consensus: some cited the efficiency of centralized planning, others were skeptical of removing local control; a consensus recommendation in Charleston. The concern: removing local control could let the state go against residents' wishes. The record: the design described has never been filed; what exists is one enacted state layer on local plans, a growth-management bill that died at the last step, and annexation fights pulling both directions.</w:t>
       </w:r>
     </w:p>
     <w:p>
@@ -2269,7 +2309,7 @@
           <w:szCs w:val="20"/>
           <w:rtl w:val="0"/>
         </w:rPr>
-        <w:t xml:space="preserve">State-level or regional comprehensive planning replacing county-by-county plans — the design participants described — appears in no bill from 2019–2026, verified against the full-text discovery and a statewide title scan.</w:t>
+        <w:t xml:space="preserve">State-level or regional comprehensive planning replacing county-by-county plans — the design participants described — appears in no bill from 2019–2026, verified against the full-text discovery and a statewide title scan. The county-by-county plans themselves are what state law requires: every planning county and city must adopt a comprehensive plan and keep it current, so counties plan continuously. What has never been filed is a state bill to replace or coordinate that system — not planning itself.</w:t>
       </w:r>
     </w:p>
     <w:p>
@@ -2307,7 +2347,7 @@
           <w:szCs w:val="20"/>
           <w:rtl w:val="0"/>
         </w:rPr>
-        <w:t xml:space="preserve">Raised in Columbia and the online session, with mixed consensus: broad agreement that maintenance needs to be factored in, but many participants want expanded infrastructure too. The concern raised: the expense of expansion versus maintaining what exists — some worried the state puts too much toward capital projects and not enough toward maintenance. The record: every standalone maintenance bill died in first committee, while the idea moved anyway — a pothole-repair program enacted inside the SCDOT overhaul, and the maintenance money running through the annual budget in exactly the one-time-capital versus recurring-rule structure participants worried about.</w:t>
+        <w:t xml:space="preserve">Raised in Columbia and the online session, with mixed consensus: maintenance must be factored in, but many participants want expanded infrastructure too. The concern: expansion expense versus upkeep — some worried too much goes to capital projects, not enough to maintenance. The record: every standalone maintenance bill died in first committee, while the idea moved anyway — a pothole-repair program enacted inside the SCDOT overhaul, and the maintenance money running through the annual budget.</w:t>
       </w:r>
     </w:p>
     <w:p>
@@ -2425,7 +2465,7 @@
           <w:szCs w:val="20"/>
           <w:rtl w:val="0"/>
         </w:rPr>
-        <w:t xml:space="preserve">the 2017 gas-tax act's extra County Transportation Committee money must be spent exclusively on repairs, maintenance, and improvements to the state highway system.</w:t>
+        <w:t xml:space="preserve">the 2017 gas-tax act's extra County Transportation Committee money must be spent exclusively on repairs, maintenance, and improvements to the state highway system. The county committees pick the actual project lists — choices recorded at the county level, not in the legislature.</w:t>
       </w:r>
     </w:p>
     <w:p>
@@ -2465,7 +2505,7 @@
           <w:szCs w:val="20"/>
           <w:rtl w:val="0"/>
         </w:rPr>
-        <w:t xml:space="preserve">FY 2024-25 (118.22) — $200,000,000 CTC Acceleration, $100,000,000 Bridge Acceleration, $117,401,000 Rural Road Safety; FY 2025-26 (118.22) — $200,000,000 Bridge Modernization; FY 2026-27 (118.21) — $175,000,000 CTC and $50,000,000 bridges.</w:t>
+        <w:t xml:space="preserve">FY 2024-25 (118.22) — $200,000,000 CTC, $100,000,000 bridges, $117,401,000 rural road safety; FY 2025-26 (118.22) — $200,000,000 bridges; FY 2026-27 (118.21) — $175,000,000 CTC, $50,000,000 bridges.</w:t>
       </w:r>
     </w:p>
     <w:p>
@@ -2505,7 +2545,7 @@
           <w:szCs w:val="20"/>
           <w:rtl w:val="0"/>
         </w:rPr>
-        <w:t xml:space="preserve">the Road Buyback Program — SCDOT identifies state roads no longer serving a statewide purpose and pays counties and cities to take them, resurfaced first; report due February 2027.</w:t>
+        <w:t xml:space="preserve">the Road Buyback Program — SCDOT identifies state roads no longer serving a statewide purpose and pays counties and cities to take them, resurfaced first.</w:t>
       </w:r>
     </w:p>
     <w:p>
@@ -2722,7 +2762,7 @@
           <w:szCs w:val="20"/>
           <w:rtl w:val="0"/>
         </w:rPr>
-        <w:t xml:space="preserve">Raised at multiple tables in Columbia and Florence, with low consensus — the sharpest split in this issue: sharp disagreement over whether new taxes are essential for improvements or whether keeping costs low is the priority, with some arguing South Carolina's low taxes are one reason infrastructure suffers. The record mirrors the split: ten gas-fee rollback measures died without hearings in the same money committees that never heard the funding-tool bills — and the one gas-fee increase died there too.</w:t>
+        <w:t xml:space="preserve">Raised at multiple tables in Columbia and Florence, with low consensus — the sharpest split in this issue: is new money essential, or is keeping costs low the priority? Some argued low taxes are one reason infrastructure suffers. The record mirrors the split: ten gas-fee rollback measures died without hearings in the same money committees that never heard the funding-tool bills — and the one gas-fee increase died there too.</w:t>
       </w:r>
     </w:p>
     <w:p>
@@ -2781,7 +2821,7 @@
           <w:szCs w:val="20"/>
           <w:rtl w:val="0"/>
         </w:rPr>
-        <w:t xml:space="preserve">H4091 (2021) — stop the 2017 act's phase-in at eight of the twelve cents; H4092 (2021) — repeal the gas user fee and road tax outright.</w:t>
+        <w:t xml:space="preserve">H4091 (2021) — stop the 2017 phase-in at eight of twelve cents; H4092 (2021) — repeal the gas user fee and road tax.</w:t>
       </w:r>
     </w:p>
     <w:p>
@@ -3078,7 +3118,7 @@
           <w:szCs w:val="20"/>
           <w:rtl w:val="0"/>
         </w:rPr>
-        <w:t xml:space="preserve">Raised in the online conversation and Greenville, with high consensus: participants widely agreed this could be a low-cost fix, felt the state was not getting quality contractors for road repairs, and pushed for more standards and transparency in bidding. The record: no standalone bidding bill ever reached a floor vote — and then the bidding methods passed anyway, inside the SCDOT Modernization Act, while the transparency tools participants described exist as one-year budget rules.</w:t>
+        <w:t xml:space="preserve">Raised in the online conversation and Greenville, with high consensus: a low-cost fix — participants felt the state was not getting quality contractors for road repairs and pushed for more standards and transparency in bidding. The record: no standalone bidding bill ever reached a floor vote — then the bidding methods passed anyway, inside the SCDOT Modernization Act, and the transparency tools live as one-year budget rules.</w:t>
       </w:r>
     </w:p>
     <w:p>

</xml_diff>